<commit_message>
Finalizacion del documento y generacion del pdf
</commit_message>
<xml_diff>
--- a/Laboratorio_1.docx
+++ b/Laboratorio_1.docx
@@ -154,7 +154,7 @@
               <w:noProof/>
             </w:rPr>
             <w:pict w14:anchorId="67ED2200">
-              <v:rect id="Rectángulo 132" o:spid="_x0000_s1026" style="position:absolute;margin-left:-4.4pt;margin-top:0;width:46.8pt;height:77.75pt;z-index:251659264;visibility:visible;mso-wrap-style:square;mso-width-percent:76;mso-height-percent:98;mso-top-percent:23;mso-wrap-distance-left:9pt;mso-wrap-distance-top:0;mso-wrap-distance-right:9pt;mso-wrap-distance-bottom:0;mso-position-horizontal:right;mso-position-horizontal-relative:margin;mso-position-vertical-relative:page;mso-width-percent:76;mso-height-percent:98;mso-top-percent:23;mso-width-relative:page;mso-height-relative:page;v-text-anchor:bottom" o:gfxdata="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" fillcolor="#156082 [3204]" stroked="f" strokeweight="1.5pt">
+              <v:rect id="Rectángulo 132" o:spid="_x0000_s1026" style="position:absolute;margin-left:-8.8pt;margin-top:0;width:46.8pt;height:77.75pt;z-index:251659264;visibility:visible;mso-wrap-style:square;mso-width-percent:76;mso-height-percent:98;mso-top-percent:23;mso-wrap-distance-left:9pt;mso-wrap-distance-top:0;mso-wrap-distance-right:9pt;mso-wrap-distance-bottom:0;mso-position-horizontal:right;mso-position-horizontal-relative:margin;mso-position-vertical-relative:page;mso-width-percent:76;mso-height-percent:98;mso-top-percent:23;mso-width-relative:page;mso-height-relative:page;v-text-anchor:bottom" o:gfxdata="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" fillcolor="#156082 [3204]" stroked="f" strokeweight="1.5pt">
                 <o:lock v:ext="edit" aspectratio="t"/>
                 <v:textbox inset="3.6pt,,3.6pt">
                   <w:txbxContent>
@@ -168,9 +168,8 @@
                         <w:alias w:val="Año"/>
                         <w:tag w:val=""/>
                         <w:id w:val="-785116381"/>
-                        <w:showingPlcHdr/>
                         <w:dataBinding w:prefixMappings="xmlns:ns0='http://schemas.microsoft.com/office/2006/coverPageProps' " w:xpath="/ns0:CoverPageProperties[1]/ns0:PublishDate[1]" w:storeItemID="{55AF091B-3C7A-41E3-B477-F2FDAA23CFDA}"/>
-                        <w:date>
+                        <w:date w:fullDate="2026-01-01T00:00:00Z">
                           <w:dateFormat w:val="yyyy"/>
                           <w:lid w:val="es-ES"/>
                           <w:storeMappedDataAs w:val="dateTime"/>
@@ -194,7 +193,7 @@
                               <w:sz w:val="24"/>
                               <w:szCs w:val="24"/>
                             </w:rPr>
-                            <w:t>[Año]</w:t>
+                            <w:t>2026</w:t>
                           </w:r>
                         </w:p>
                       </w:sdtContent>
@@ -213,6 +212,10 @@
     </w:sdt>
     <w:sdt>
       <w:sdtPr>
+        <w:rPr>
+          <w:b w:val="0"/>
+          <w:sz w:val="21"/>
+        </w:rPr>
         <w:id w:val="-1753339792"/>
         <w:docPartObj>
           <w:docPartGallery w:val="Table of Contents"/>
@@ -221,8 +224,10 @@
       </w:sdtPr>
       <w:sdtEndPr>
         <w:rPr>
+          <w:rFonts w:ascii="Calibri" w:hAnsi="Calibri" w:cs="Calibri"/>
           <w:bCs/>
-          <w:sz w:val="21"/>
+          <w:sz w:val="24"/>
+          <w:szCs w:val="24"/>
         </w:rPr>
       </w:sdtEndPr>
       <w:sdtContent>
@@ -245,8 +250,10 @@
             <w:tabs>
               <w:tab w:val="right" w:leader="dot" w:pos="11110"/>
             </w:tabs>
+            <w:spacing w:before="100" w:beforeAutospacing="1" w:after="100" w:afterAutospacing="1" w:line="360" w:lineRule="auto"/>
+            <w:contextualSpacing w:val="0"/>
             <w:rPr>
-              <w:rFonts w:asciiTheme="minorHAnsi" w:eastAsiaTheme="minorEastAsia" w:hAnsiTheme="minorHAnsi" w:cstheme="minorBidi"/>
+              <w:rFonts w:ascii="Calibri" w:eastAsiaTheme="minorEastAsia" w:hAnsi="Calibri" w:cs="Calibri"/>
               <w:noProof/>
               <w:kern w:val="2"/>
               <w:sz w:val="24"/>
@@ -255,67 +262,106 @@
             </w:rPr>
           </w:pPr>
           <w:r>
+            <w:rPr>
+              <w:rFonts w:ascii="Calibri" w:hAnsi="Calibri" w:cs="Calibri"/>
+              <w:sz w:val="24"/>
+              <w:szCs w:val="24"/>
+            </w:rPr>
             <w:fldChar w:fldCharType="begin"/>
           </w:r>
           <w:r>
+            <w:rPr>
+              <w:rFonts w:ascii="Calibri" w:hAnsi="Calibri" w:cs="Calibri"/>
+              <w:sz w:val="24"/>
+              <w:szCs w:val="24"/>
+            </w:rPr>
             <w:instrText xml:space="preserve"> TOC \o "1-3" \h \z \u </w:instrText>
           </w:r>
           <w:r>
+            <w:rPr>
+              <w:rFonts w:ascii="Calibri" w:hAnsi="Calibri" w:cs="Calibri"/>
+              <w:sz w:val="24"/>
+              <w:szCs w:val="24"/>
+            </w:rPr>
             <w:fldChar w:fldCharType="separate"/>
           </w:r>
-          <w:hyperlink w:anchor="_Toc228825868" w:history="1">
+          <w:hyperlink w:anchor="_Toc228826719" w:history="1">
             <w:r>
               <w:rPr>
                 <w:rStyle w:val="Hipervnculo"/>
-                <w:noProof/>
+                <w:rFonts w:ascii="Calibri" w:hAnsi="Calibri" w:cs="Calibri"/>
+                <w:noProof/>
+                <w:sz w:val="24"/>
+                <w:szCs w:val="24"/>
               </w:rPr>
               <w:t>Código inicial</w:t>
             </w:r>
             <w:r>
               <w:rPr>
-                <w:noProof/>
-                <w:webHidden/>
+                <w:rFonts w:ascii="Calibri" w:hAnsi="Calibri" w:cs="Calibri"/>
+                <w:noProof/>
+                <w:webHidden/>
+                <w:sz w:val="24"/>
+                <w:szCs w:val="24"/>
               </w:rPr>
               <w:tab/>
             </w:r>
             <w:r>
               <w:rPr>
-                <w:noProof/>
-                <w:webHidden/>
+                <w:rFonts w:ascii="Calibri" w:hAnsi="Calibri" w:cs="Calibri"/>
+                <w:noProof/>
+                <w:webHidden/>
+                <w:sz w:val="24"/>
+                <w:szCs w:val="24"/>
               </w:rPr>
               <w:fldChar w:fldCharType="begin"/>
             </w:r>
             <w:r>
               <w:rPr>
-                <w:noProof/>
-                <w:webHidden/>
-              </w:rPr>
-              <w:instrText xml:space="preserve"> PAGEREF _Toc228825868 \h </w:instrText>
-            </w:r>
-            <w:r>
-              <w:rPr>
-                <w:noProof/>
-                <w:webHidden/>
-              </w:rPr>
-            </w:r>
-            <w:r>
-              <w:rPr>
-                <w:noProof/>
-                <w:webHidden/>
+                <w:rFonts w:ascii="Calibri" w:hAnsi="Calibri" w:cs="Calibri"/>
+                <w:noProof/>
+                <w:webHidden/>
+                <w:sz w:val="24"/>
+                <w:szCs w:val="24"/>
+              </w:rPr>
+              <w:instrText xml:space="preserve"> PAGEREF _Toc228826719 \h </w:instrText>
+            </w:r>
+            <w:r>
+              <w:rPr>
+                <w:rFonts w:ascii="Calibri" w:hAnsi="Calibri" w:cs="Calibri"/>
+                <w:noProof/>
+                <w:webHidden/>
+                <w:sz w:val="24"/>
+                <w:szCs w:val="24"/>
+              </w:rPr>
+            </w:r>
+            <w:r>
+              <w:rPr>
+                <w:rFonts w:ascii="Calibri" w:hAnsi="Calibri" w:cs="Calibri"/>
+                <w:noProof/>
+                <w:webHidden/>
+                <w:sz w:val="24"/>
+                <w:szCs w:val="24"/>
               </w:rPr>
               <w:fldChar w:fldCharType="separate"/>
             </w:r>
             <w:r>
               <w:rPr>
-                <w:noProof/>
-                <w:webHidden/>
+                <w:rFonts w:ascii="Calibri" w:hAnsi="Calibri" w:cs="Calibri"/>
+                <w:noProof/>
+                <w:webHidden/>
+                <w:sz w:val="24"/>
+                <w:szCs w:val="24"/>
               </w:rPr>
               <w:t>1</w:t>
             </w:r>
             <w:r>
               <w:rPr>
-                <w:noProof/>
-                <w:webHidden/>
+                <w:rFonts w:ascii="Calibri" w:hAnsi="Calibri" w:cs="Calibri"/>
+                <w:noProof/>
+                <w:webHidden/>
+                <w:sz w:val="24"/>
+                <w:szCs w:val="24"/>
               </w:rPr>
               <w:fldChar w:fldCharType="end"/>
             </w:r>
@@ -327,8 +373,10 @@
             <w:tabs>
               <w:tab w:val="right" w:leader="dot" w:pos="11110"/>
             </w:tabs>
+            <w:spacing w:before="100" w:beforeAutospacing="1" w:after="100" w:afterAutospacing="1" w:line="360" w:lineRule="auto"/>
+            <w:contextualSpacing w:val="0"/>
             <w:rPr>
-              <w:rFonts w:asciiTheme="minorHAnsi" w:eastAsiaTheme="minorEastAsia" w:hAnsiTheme="minorHAnsi" w:cstheme="minorBidi"/>
+              <w:rFonts w:ascii="Calibri" w:eastAsiaTheme="minorEastAsia" w:hAnsi="Calibri" w:cs="Calibri"/>
               <w:noProof/>
               <w:kern w:val="2"/>
               <w:sz w:val="24"/>
@@ -336,59 +384,83 @@
               <w14:ligatures w14:val="standardContextual"/>
             </w:rPr>
           </w:pPr>
-          <w:hyperlink w:anchor="_Toc228825869" w:history="1">
+          <w:hyperlink w:anchor="_Toc228826720" w:history="1">
             <w:r>
               <w:rPr>
                 <w:rStyle w:val="Hipervnculo"/>
-                <w:noProof/>
+                <w:rFonts w:ascii="Calibri" w:hAnsi="Calibri" w:cs="Calibri"/>
+                <w:noProof/>
+                <w:sz w:val="24"/>
+                <w:szCs w:val="24"/>
               </w:rPr>
               <w:t>Diferencias progresivas, regresivas y centrales de orden 2</w:t>
             </w:r>
             <w:r>
               <w:rPr>
-                <w:noProof/>
-                <w:webHidden/>
+                <w:rFonts w:ascii="Calibri" w:hAnsi="Calibri" w:cs="Calibri"/>
+                <w:noProof/>
+                <w:webHidden/>
+                <w:sz w:val="24"/>
+                <w:szCs w:val="24"/>
               </w:rPr>
               <w:tab/>
             </w:r>
             <w:r>
               <w:rPr>
-                <w:noProof/>
-                <w:webHidden/>
+                <w:rFonts w:ascii="Calibri" w:hAnsi="Calibri" w:cs="Calibri"/>
+                <w:noProof/>
+                <w:webHidden/>
+                <w:sz w:val="24"/>
+                <w:szCs w:val="24"/>
               </w:rPr>
               <w:fldChar w:fldCharType="begin"/>
             </w:r>
             <w:r>
               <w:rPr>
-                <w:noProof/>
-                <w:webHidden/>
-              </w:rPr>
-              <w:instrText xml:space="preserve"> PAGEREF _Toc228825869 \h </w:instrText>
-            </w:r>
-            <w:r>
-              <w:rPr>
-                <w:noProof/>
-                <w:webHidden/>
-              </w:rPr>
-            </w:r>
-            <w:r>
-              <w:rPr>
-                <w:noProof/>
-                <w:webHidden/>
+                <w:rFonts w:ascii="Calibri" w:hAnsi="Calibri" w:cs="Calibri"/>
+                <w:noProof/>
+                <w:webHidden/>
+                <w:sz w:val="24"/>
+                <w:szCs w:val="24"/>
+              </w:rPr>
+              <w:instrText xml:space="preserve"> PAGEREF _Toc228826720 \h </w:instrText>
+            </w:r>
+            <w:r>
+              <w:rPr>
+                <w:rFonts w:ascii="Calibri" w:hAnsi="Calibri" w:cs="Calibri"/>
+                <w:noProof/>
+                <w:webHidden/>
+                <w:sz w:val="24"/>
+                <w:szCs w:val="24"/>
+              </w:rPr>
+            </w:r>
+            <w:r>
+              <w:rPr>
+                <w:rFonts w:ascii="Calibri" w:hAnsi="Calibri" w:cs="Calibri"/>
+                <w:noProof/>
+                <w:webHidden/>
+                <w:sz w:val="24"/>
+                <w:szCs w:val="24"/>
               </w:rPr>
               <w:fldChar w:fldCharType="separate"/>
             </w:r>
             <w:r>
               <w:rPr>
-                <w:noProof/>
-                <w:webHidden/>
+                <w:rFonts w:ascii="Calibri" w:hAnsi="Calibri" w:cs="Calibri"/>
+                <w:noProof/>
+                <w:webHidden/>
+                <w:sz w:val="24"/>
+                <w:szCs w:val="24"/>
               </w:rPr>
               <w:t>1</w:t>
             </w:r>
             <w:r>
               <w:rPr>
-                <w:noProof/>
-                <w:webHidden/>
+                <w:rFonts w:ascii="Calibri" w:hAnsi="Calibri" w:cs="Calibri"/>
+                <w:noProof/>
+                <w:webHidden/>
+                <w:sz w:val="24"/>
+                <w:szCs w:val="24"/>
               </w:rPr>
               <w:fldChar w:fldCharType="end"/>
             </w:r>
@@ -400,8 +472,10 @@
             <w:tabs>
               <w:tab w:val="right" w:leader="dot" w:pos="11110"/>
             </w:tabs>
+            <w:spacing w:before="100" w:beforeAutospacing="1" w:after="100" w:afterAutospacing="1" w:line="360" w:lineRule="auto"/>
+            <w:contextualSpacing w:val="0"/>
             <w:rPr>
-              <w:rFonts w:asciiTheme="minorHAnsi" w:eastAsiaTheme="minorEastAsia" w:hAnsiTheme="minorHAnsi" w:cstheme="minorBidi"/>
+              <w:rFonts w:ascii="Calibri" w:eastAsiaTheme="minorEastAsia" w:hAnsi="Calibri" w:cs="Calibri"/>
               <w:noProof/>
               <w:kern w:val="2"/>
               <w:sz w:val="24"/>
@@ -409,59 +483,83 @@
               <w14:ligatures w14:val="standardContextual"/>
             </w:rPr>
           </w:pPr>
-          <w:hyperlink w:anchor="_Toc228825870" w:history="1">
+          <w:hyperlink w:anchor="_Toc228826721" w:history="1">
             <w:r>
               <w:rPr>
                 <w:rStyle w:val="Hipervnculo"/>
-                <w:noProof/>
+                <w:rFonts w:ascii="Calibri" w:hAnsi="Calibri" w:cs="Calibri"/>
+                <w:noProof/>
+                <w:sz w:val="24"/>
+                <w:szCs w:val="24"/>
               </w:rPr>
               <w:t>Interpolación de Lagrange</w:t>
             </w:r>
             <w:r>
               <w:rPr>
-                <w:noProof/>
-                <w:webHidden/>
+                <w:rFonts w:ascii="Calibri" w:hAnsi="Calibri" w:cs="Calibri"/>
+                <w:noProof/>
+                <w:webHidden/>
+                <w:sz w:val="24"/>
+                <w:szCs w:val="24"/>
               </w:rPr>
               <w:tab/>
             </w:r>
             <w:r>
               <w:rPr>
-                <w:noProof/>
-                <w:webHidden/>
+                <w:rFonts w:ascii="Calibri" w:hAnsi="Calibri" w:cs="Calibri"/>
+                <w:noProof/>
+                <w:webHidden/>
+                <w:sz w:val="24"/>
+                <w:szCs w:val="24"/>
               </w:rPr>
               <w:fldChar w:fldCharType="begin"/>
             </w:r>
             <w:r>
               <w:rPr>
-                <w:noProof/>
-                <w:webHidden/>
-              </w:rPr>
-              <w:instrText xml:space="preserve"> PAGEREF _Toc228825870 \h </w:instrText>
-            </w:r>
-            <w:r>
-              <w:rPr>
-                <w:noProof/>
-                <w:webHidden/>
-              </w:rPr>
-            </w:r>
-            <w:r>
-              <w:rPr>
-                <w:noProof/>
-                <w:webHidden/>
+                <w:rFonts w:ascii="Calibri" w:hAnsi="Calibri" w:cs="Calibri"/>
+                <w:noProof/>
+                <w:webHidden/>
+                <w:sz w:val="24"/>
+                <w:szCs w:val="24"/>
+              </w:rPr>
+              <w:instrText xml:space="preserve"> PAGEREF _Toc228826721 \h </w:instrText>
+            </w:r>
+            <w:r>
+              <w:rPr>
+                <w:rFonts w:ascii="Calibri" w:hAnsi="Calibri" w:cs="Calibri"/>
+                <w:noProof/>
+                <w:webHidden/>
+                <w:sz w:val="24"/>
+                <w:szCs w:val="24"/>
+              </w:rPr>
+            </w:r>
+            <w:r>
+              <w:rPr>
+                <w:rFonts w:ascii="Calibri" w:hAnsi="Calibri" w:cs="Calibri"/>
+                <w:noProof/>
+                <w:webHidden/>
+                <w:sz w:val="24"/>
+                <w:szCs w:val="24"/>
               </w:rPr>
               <w:fldChar w:fldCharType="separate"/>
             </w:r>
             <w:r>
               <w:rPr>
-                <w:noProof/>
-                <w:webHidden/>
-              </w:rPr>
-              <w:t>2</w:t>
-            </w:r>
-            <w:r>
-              <w:rPr>
-                <w:noProof/>
-                <w:webHidden/>
+                <w:rFonts w:ascii="Calibri" w:hAnsi="Calibri" w:cs="Calibri"/>
+                <w:noProof/>
+                <w:webHidden/>
+                <w:sz w:val="24"/>
+                <w:szCs w:val="24"/>
+              </w:rPr>
+              <w:t>3</w:t>
+            </w:r>
+            <w:r>
+              <w:rPr>
+                <w:rFonts w:ascii="Calibri" w:hAnsi="Calibri" w:cs="Calibri"/>
+                <w:noProof/>
+                <w:webHidden/>
+                <w:sz w:val="24"/>
+                <w:szCs w:val="24"/>
               </w:rPr>
               <w:fldChar w:fldCharType="end"/>
             </w:r>
@@ -473,8 +571,10 @@
             <w:tabs>
               <w:tab w:val="right" w:leader="dot" w:pos="11110"/>
             </w:tabs>
+            <w:spacing w:before="100" w:beforeAutospacing="1" w:after="100" w:afterAutospacing="1" w:line="360" w:lineRule="auto"/>
+            <w:contextualSpacing w:val="0"/>
             <w:rPr>
-              <w:rFonts w:asciiTheme="minorHAnsi" w:eastAsiaTheme="minorEastAsia" w:hAnsiTheme="minorHAnsi" w:cstheme="minorBidi"/>
+              <w:rFonts w:ascii="Calibri" w:eastAsiaTheme="minorEastAsia" w:hAnsi="Calibri" w:cs="Calibri"/>
               <w:noProof/>
               <w:kern w:val="2"/>
               <w:sz w:val="24"/>
@@ -482,59 +582,83 @@
               <w14:ligatures w14:val="standardContextual"/>
             </w:rPr>
           </w:pPr>
-          <w:hyperlink w:anchor="_Toc228825871" w:history="1">
+          <w:hyperlink w:anchor="_Toc228826722" w:history="1">
             <w:r>
               <w:rPr>
                 <w:rStyle w:val="Hipervnculo"/>
-                <w:noProof/>
+                <w:rFonts w:ascii="Calibri" w:hAnsi="Calibri" w:cs="Calibri"/>
+                <w:noProof/>
+                <w:sz w:val="24"/>
+                <w:szCs w:val="24"/>
               </w:rPr>
               <w:t>Cálculo de la segunda derivada</w:t>
             </w:r>
             <w:r>
               <w:rPr>
-                <w:noProof/>
-                <w:webHidden/>
+                <w:rFonts w:ascii="Calibri" w:hAnsi="Calibri" w:cs="Calibri"/>
+                <w:noProof/>
+                <w:webHidden/>
+                <w:sz w:val="24"/>
+                <w:szCs w:val="24"/>
               </w:rPr>
               <w:tab/>
             </w:r>
             <w:r>
               <w:rPr>
-                <w:noProof/>
-                <w:webHidden/>
+                <w:rFonts w:ascii="Calibri" w:hAnsi="Calibri" w:cs="Calibri"/>
+                <w:noProof/>
+                <w:webHidden/>
+                <w:sz w:val="24"/>
+                <w:szCs w:val="24"/>
               </w:rPr>
               <w:fldChar w:fldCharType="begin"/>
             </w:r>
             <w:r>
               <w:rPr>
-                <w:noProof/>
-                <w:webHidden/>
-              </w:rPr>
-              <w:instrText xml:space="preserve"> PAGEREF _Toc228825871 \h </w:instrText>
-            </w:r>
-            <w:r>
-              <w:rPr>
-                <w:noProof/>
-                <w:webHidden/>
-              </w:rPr>
-            </w:r>
-            <w:r>
-              <w:rPr>
-                <w:noProof/>
-                <w:webHidden/>
+                <w:rFonts w:ascii="Calibri" w:hAnsi="Calibri" w:cs="Calibri"/>
+                <w:noProof/>
+                <w:webHidden/>
+                <w:sz w:val="24"/>
+                <w:szCs w:val="24"/>
+              </w:rPr>
+              <w:instrText xml:space="preserve"> PAGEREF _Toc228826722 \h </w:instrText>
+            </w:r>
+            <w:r>
+              <w:rPr>
+                <w:rFonts w:ascii="Calibri" w:hAnsi="Calibri" w:cs="Calibri"/>
+                <w:noProof/>
+                <w:webHidden/>
+                <w:sz w:val="24"/>
+                <w:szCs w:val="24"/>
+              </w:rPr>
+            </w:r>
+            <w:r>
+              <w:rPr>
+                <w:rFonts w:ascii="Calibri" w:hAnsi="Calibri" w:cs="Calibri"/>
+                <w:noProof/>
+                <w:webHidden/>
+                <w:sz w:val="24"/>
+                <w:szCs w:val="24"/>
               </w:rPr>
               <w:fldChar w:fldCharType="separate"/>
             </w:r>
             <w:r>
               <w:rPr>
-                <w:noProof/>
-                <w:webHidden/>
-              </w:rPr>
-              <w:t>3</w:t>
-            </w:r>
-            <w:r>
-              <w:rPr>
-                <w:noProof/>
-                <w:webHidden/>
+                <w:rFonts w:ascii="Calibri" w:hAnsi="Calibri" w:cs="Calibri"/>
+                <w:noProof/>
+                <w:webHidden/>
+                <w:sz w:val="24"/>
+                <w:szCs w:val="24"/>
+              </w:rPr>
+              <w:t>4</w:t>
+            </w:r>
+            <w:r>
+              <w:rPr>
+                <w:rFonts w:ascii="Calibri" w:hAnsi="Calibri" w:cs="Calibri"/>
+                <w:noProof/>
+                <w:webHidden/>
+                <w:sz w:val="24"/>
+                <w:szCs w:val="24"/>
               </w:rPr>
               <w:fldChar w:fldCharType="end"/>
             </w:r>
@@ -546,8 +670,10 @@
             <w:tabs>
               <w:tab w:val="right" w:leader="dot" w:pos="11110"/>
             </w:tabs>
+            <w:spacing w:before="100" w:beforeAutospacing="1" w:after="100" w:afterAutospacing="1" w:line="360" w:lineRule="auto"/>
+            <w:contextualSpacing w:val="0"/>
             <w:rPr>
-              <w:rFonts w:asciiTheme="minorHAnsi" w:eastAsiaTheme="minorEastAsia" w:hAnsiTheme="minorHAnsi" w:cstheme="minorBidi"/>
+              <w:rFonts w:ascii="Calibri" w:eastAsiaTheme="minorEastAsia" w:hAnsi="Calibri" w:cs="Calibri"/>
               <w:noProof/>
               <w:kern w:val="2"/>
               <w:sz w:val="24"/>
@@ -555,69 +681,203 @@
               <w14:ligatures w14:val="standardContextual"/>
             </w:rPr>
           </w:pPr>
-          <w:hyperlink w:anchor="_Toc228825872" w:history="1">
+          <w:hyperlink w:anchor="_Toc228826723" w:history="1">
             <w:r>
               <w:rPr>
                 <w:rStyle w:val="Hipervnculo"/>
-                <w:noProof/>
-              </w:rPr>
-              <w:t>Enlace al repositorio de GitHub con los archivos generados</w:t>
-            </w:r>
-            <w:r>
-              <w:rPr>
-                <w:noProof/>
-                <w:webHidden/>
+                <w:rFonts w:ascii="Calibri" w:hAnsi="Calibri" w:cs="Calibri"/>
+                <w:noProof/>
+                <w:sz w:val="24"/>
+                <w:szCs w:val="24"/>
+              </w:rPr>
+              <w:t>Conclusiones</w:t>
+            </w:r>
+            <w:r>
+              <w:rPr>
+                <w:rFonts w:ascii="Calibri" w:hAnsi="Calibri" w:cs="Calibri"/>
+                <w:noProof/>
+                <w:webHidden/>
+                <w:sz w:val="24"/>
+                <w:szCs w:val="24"/>
               </w:rPr>
               <w:tab/>
             </w:r>
             <w:r>
               <w:rPr>
-                <w:noProof/>
-                <w:webHidden/>
+                <w:rFonts w:ascii="Calibri" w:hAnsi="Calibri" w:cs="Calibri"/>
+                <w:noProof/>
+                <w:webHidden/>
+                <w:sz w:val="24"/>
+                <w:szCs w:val="24"/>
               </w:rPr>
               <w:fldChar w:fldCharType="begin"/>
             </w:r>
             <w:r>
               <w:rPr>
-                <w:noProof/>
-                <w:webHidden/>
-              </w:rPr>
-              <w:instrText xml:space="preserve"> PAGEREF _Toc228825872 \h </w:instrText>
-            </w:r>
-            <w:r>
-              <w:rPr>
-                <w:noProof/>
-                <w:webHidden/>
-              </w:rPr>
-            </w:r>
-            <w:r>
-              <w:rPr>
-                <w:noProof/>
-                <w:webHidden/>
+                <w:rFonts w:ascii="Calibri" w:hAnsi="Calibri" w:cs="Calibri"/>
+                <w:noProof/>
+                <w:webHidden/>
+                <w:sz w:val="24"/>
+                <w:szCs w:val="24"/>
+              </w:rPr>
+              <w:instrText xml:space="preserve"> PAGEREF _Toc228826723 \h </w:instrText>
+            </w:r>
+            <w:r>
+              <w:rPr>
+                <w:rFonts w:ascii="Calibri" w:hAnsi="Calibri" w:cs="Calibri"/>
+                <w:noProof/>
+                <w:webHidden/>
+                <w:sz w:val="24"/>
+                <w:szCs w:val="24"/>
+              </w:rPr>
+            </w:r>
+            <w:r>
+              <w:rPr>
+                <w:rFonts w:ascii="Calibri" w:hAnsi="Calibri" w:cs="Calibri"/>
+                <w:noProof/>
+                <w:webHidden/>
+                <w:sz w:val="24"/>
+                <w:szCs w:val="24"/>
               </w:rPr>
               <w:fldChar w:fldCharType="separate"/>
             </w:r>
             <w:r>
               <w:rPr>
-                <w:noProof/>
-                <w:webHidden/>
-              </w:rPr>
-              <w:t>4</w:t>
-            </w:r>
-            <w:r>
-              <w:rPr>
-                <w:noProof/>
-                <w:webHidden/>
+                <w:rFonts w:ascii="Calibri" w:hAnsi="Calibri" w:cs="Calibri"/>
+                <w:noProof/>
+                <w:webHidden/>
+                <w:sz w:val="24"/>
+                <w:szCs w:val="24"/>
+              </w:rPr>
+              <w:t>5</w:t>
+            </w:r>
+            <w:r>
+              <w:rPr>
+                <w:rFonts w:ascii="Calibri" w:hAnsi="Calibri" w:cs="Calibri"/>
+                <w:noProof/>
+                <w:webHidden/>
+                <w:sz w:val="24"/>
+                <w:szCs w:val="24"/>
               </w:rPr>
               <w:fldChar w:fldCharType="end"/>
             </w:r>
           </w:hyperlink>
         </w:p>
         <w:p>
+          <w:pPr>
+            <w:pStyle w:val="TDC1"/>
+            <w:tabs>
+              <w:tab w:val="right" w:leader="dot" w:pos="11110"/>
+            </w:tabs>
+            <w:spacing w:before="100" w:beforeAutospacing="1" w:after="100" w:afterAutospacing="1" w:line="360" w:lineRule="auto"/>
+            <w:contextualSpacing w:val="0"/>
+            <w:rPr>
+              <w:rFonts w:ascii="Calibri" w:eastAsiaTheme="minorEastAsia" w:hAnsi="Calibri" w:cs="Calibri"/>
+              <w:noProof/>
+              <w:kern w:val="2"/>
+              <w:sz w:val="24"/>
+              <w:szCs w:val="24"/>
+              <w14:ligatures w14:val="standardContextual"/>
+            </w:rPr>
+          </w:pPr>
+          <w:hyperlink w:anchor="_Toc228826724" w:history="1">
+            <w:r>
+              <w:rPr>
+                <w:rStyle w:val="Hipervnculo"/>
+                <w:rFonts w:ascii="Calibri" w:hAnsi="Calibri" w:cs="Calibri"/>
+                <w:noProof/>
+                <w:sz w:val="24"/>
+                <w:szCs w:val="24"/>
+              </w:rPr>
+              <w:t>Enlace al repositorio de GitHub con los archivos generados</w:t>
+            </w:r>
+            <w:r>
+              <w:rPr>
+                <w:rFonts w:ascii="Calibri" w:hAnsi="Calibri" w:cs="Calibri"/>
+                <w:noProof/>
+                <w:webHidden/>
+                <w:sz w:val="24"/>
+                <w:szCs w:val="24"/>
+              </w:rPr>
+              <w:tab/>
+            </w:r>
+            <w:r>
+              <w:rPr>
+                <w:rFonts w:ascii="Calibri" w:hAnsi="Calibri" w:cs="Calibri"/>
+                <w:noProof/>
+                <w:webHidden/>
+                <w:sz w:val="24"/>
+                <w:szCs w:val="24"/>
+              </w:rPr>
+              <w:fldChar w:fldCharType="begin"/>
+            </w:r>
+            <w:r>
+              <w:rPr>
+                <w:rFonts w:ascii="Calibri" w:hAnsi="Calibri" w:cs="Calibri"/>
+                <w:noProof/>
+                <w:webHidden/>
+                <w:sz w:val="24"/>
+                <w:szCs w:val="24"/>
+              </w:rPr>
+              <w:instrText xml:space="preserve"> PAGEREF _Toc228826724 \h </w:instrText>
+            </w:r>
+            <w:r>
+              <w:rPr>
+                <w:rFonts w:ascii="Calibri" w:hAnsi="Calibri" w:cs="Calibri"/>
+                <w:noProof/>
+                <w:webHidden/>
+                <w:sz w:val="24"/>
+                <w:szCs w:val="24"/>
+              </w:rPr>
+            </w:r>
+            <w:r>
+              <w:rPr>
+                <w:rFonts w:ascii="Calibri" w:hAnsi="Calibri" w:cs="Calibri"/>
+                <w:noProof/>
+                <w:webHidden/>
+                <w:sz w:val="24"/>
+                <w:szCs w:val="24"/>
+              </w:rPr>
+              <w:fldChar w:fldCharType="separate"/>
+            </w:r>
+            <w:r>
+              <w:rPr>
+                <w:rFonts w:ascii="Calibri" w:hAnsi="Calibri" w:cs="Calibri"/>
+                <w:noProof/>
+                <w:webHidden/>
+                <w:sz w:val="24"/>
+                <w:szCs w:val="24"/>
+              </w:rPr>
+              <w:t>6</w:t>
+            </w:r>
+            <w:r>
+              <w:rPr>
+                <w:rFonts w:ascii="Calibri" w:hAnsi="Calibri" w:cs="Calibri"/>
+                <w:noProof/>
+                <w:webHidden/>
+                <w:sz w:val="24"/>
+                <w:szCs w:val="24"/>
+              </w:rPr>
+              <w:fldChar w:fldCharType="end"/>
+            </w:r>
+          </w:hyperlink>
+        </w:p>
+        <w:p>
+          <w:pPr>
+            <w:spacing w:before="100" w:beforeAutospacing="1" w:after="100" w:afterAutospacing="1" w:line="360" w:lineRule="auto"/>
+            <w:rPr>
+              <w:rFonts w:ascii="Calibri" w:hAnsi="Calibri" w:cs="Calibri"/>
+              <w:sz w:val="24"/>
+              <w:szCs w:val="24"/>
+            </w:rPr>
+          </w:pPr>
           <w:r>
             <w:rPr>
+              <w:rFonts w:ascii="Calibri" w:hAnsi="Calibri" w:cs="Calibri"/>
               <w:b/>
               <w:bCs/>
+              <w:sz w:val="24"/>
+              <w:szCs w:val="24"/>
             </w:rPr>
             <w:fldChar w:fldCharType="end"/>
           </w:r>
@@ -638,7 +898,7 @@
       <w:pPr>
         <w:pStyle w:val="Ttulo1"/>
         <w:sectPr>
-          <w:footerReference w:type="first" r:id="rId8"/>
+          <w:footerReference w:type="first" r:id="rId9"/>
           <w:pgSz w:w="12240" w:h="15840"/>
           <w:pgMar w:top="560" w:right="560" w:bottom="560" w:left="560" w:header="720" w:footer="720" w:gutter="0"/>
           <w:pgNumType w:start="0"/>
@@ -652,13 +912,10 @@
       <w:pPr>
         <w:pStyle w:val="Ttulo1"/>
       </w:pPr>
-      <w:bookmarkStart w:id="0" w:name="_Toc228825868"/>
+      <w:bookmarkStart w:id="0" w:name="_Toc228826719"/>
       <w:r>
         <w:lastRenderedPageBreak/>
-        <w:t>Código</w:t>
-      </w:r>
-      <w:r>
-        <w:t xml:space="preserve"> inicial</w:t>
+        <w:t>Código inicial</w:t>
       </w:r>
       <w:bookmarkEnd w:id="0"/>
     </w:p>
@@ -990,7 +1247,7 @@
       <w:pPr>
         <w:pStyle w:val="Ttulo1"/>
       </w:pPr>
-      <w:bookmarkStart w:id="1" w:name="_Toc228825869"/>
+      <w:bookmarkStart w:id="1" w:name="_Toc228826720"/>
       <w:r>
         <w:t>Diferencias progresivas, regresivas y centrales de orden 2</w:t>
       </w:r>
@@ -1019,21 +1276,135 @@
     <w:p>
       <w:pPr>
         <w:pStyle w:val="Text"/>
-      </w:pPr>
-      <w:r>
-        <w:t xml:space="preserve">Al finalizar este bloque de </w:t>
-      </w:r>
-      <w:r>
-        <w:t>código</w:t>
-      </w:r>
-      <w:r>
-        <w:t xml:space="preserve">, se presenta la </w:t>
-      </w:r>
-      <w:r>
-        <w:t>información</w:t>
-      </w:r>
-      <w:r>
-        <w:t xml:space="preserve"> en forma de tabla para poder estudiarla.</w:t>
+        <w:contextualSpacing/>
+      </w:pPr>
+      <w:r>
+        <w:lastRenderedPageBreak/>
+        <w:t>Las diferencias finitas constituyen una herramienta fundamental en los métodos numéricos para aproximar derivadas a partir de valores discretos de una función. Estas aproximaciones se basan en el desarrollo en serie de Taylor, lo que permite expresar la derivada en un punto a partir de los valores de la función en puntos cercanos.</w:t>
+      </w:r>
+    </w:p>
+    <w:p>
+      <w:pPr>
+        <w:pStyle w:val="Text"/>
+        <w:contextualSpacing/>
+      </w:pPr>
+      <w:r>
+        <w:t>En este trabajo se han utilizado esquemas de diferencias finitas de orden 2, cuyo error es proporcional a h², siendo h la distancia entre los puntos. Este tipo de esquemas proporciona una mayor precisión en comparación con aproximaciones de orden inferior.</w:t>
+      </w:r>
+    </w:p>
+    <w:p>
+      <w:pPr>
+        <w:pStyle w:val="Text"/>
+        <w:contextualSpacing/>
+      </w:pPr>
+      <w:r>
+        <w:t>Concretamente, se han empleado tres tipos de aproximaciones en función de la posición del punto dentro de la tabla:</w:t>
+      </w:r>
+    </w:p>
+    <w:p>
+      <w:pPr>
+        <w:pStyle w:val="Text"/>
+        <w:numPr>
+          <w:ilvl w:val="0"/>
+          <w:numId w:val="2"/>
+        </w:numPr>
+        <w:contextualSpacing/>
+      </w:pPr>
+      <w:r>
+        <w:t xml:space="preserve">Diferencias progresivas de orden 2, utilizadas en el primer punto, ya que no se dispone de valores anteriores. </w:t>
+      </w:r>
+    </w:p>
+    <w:p>
+      <w:pPr>
+        <w:pStyle w:val="Text"/>
+        <w:numPr>
+          <w:ilvl w:val="0"/>
+          <w:numId w:val="2"/>
+        </w:numPr>
+        <w:contextualSpacing/>
+      </w:pPr>
+      <w:r>
+        <w:t xml:space="preserve">Diferencias regresivas de orden 2, aplicadas en el último punto, donde no se dispone de valores posteriores. </w:t>
+      </w:r>
+    </w:p>
+    <w:p>
+      <w:pPr>
+        <w:pStyle w:val="Text"/>
+        <w:numPr>
+          <w:ilvl w:val="0"/>
+          <w:numId w:val="2"/>
+        </w:numPr>
+        <w:contextualSpacing/>
+      </w:pPr>
+      <w:r>
+        <w:t xml:space="preserve">Diferencias centrales de orden 2, empleadas en los puntos intermedios, permitiendo una aproximación más precisa al utilizar información a ambos lados del punto. </w:t>
+      </w:r>
+    </w:p>
+    <w:p>
+      <w:pPr>
+        <w:pStyle w:val="Text"/>
+        <w:contextualSpacing/>
+      </w:pPr>
+      <w:r>
+        <w:t xml:space="preserve">A partir de estas aproximaciones, se ha calculado la derivada de </w:t>
+      </w:r>
+      <w:r>
+        <w:t>B</w:t>
+      </w:r>
+      <w:r>
+        <w:t xml:space="preserve">eta respecto a </w:t>
+      </w:r>
+      <w:r>
+        <w:t>Alpha</w:t>
+      </w:r>
+      <w:r>
+        <w:t xml:space="preserve"> utilizando los valores tabulados. Posteriormente, se ha obtenido la velocidad angular del eslabón BC mediante la relación:</w:t>
+      </w:r>
+    </w:p>
+    <w:p>
+      <w:pPr>
+        <w:pStyle w:val="Text"/>
+      </w:pPr>
+      <m:oMathPara>
+        <m:oMath>
+          <m:r>
+            <w:rPr>
+              <w:rFonts w:ascii="Cambria Math" w:hAnsi="Cambria Math"/>
+            </w:rPr>
+            <m:t>d(beta)/dt = d(beta)/d(alpha) · d(alpha)/dt</m:t>
+          </m:r>
+        </m:oMath>
+      </m:oMathPara>
+    </w:p>
+    <w:p>
+      <w:pPr>
+        <w:pStyle w:val="Text"/>
+        <w:contextualSpacing/>
+      </w:pPr>
+      <w:r>
+        <w:t xml:space="preserve">donde la velocidad angular del eslabón AB es constante e igual a 15 rad/s. De este modo, se obtiene una aproximación numérica de la velocidad angular de </w:t>
+      </w:r>
+      <w:r>
+        <w:t>B</w:t>
+      </w:r>
+      <w:r>
+        <w:t>eta en cada uno de los puntos.</w:t>
+      </w:r>
+    </w:p>
+    <w:p>
+      <w:pPr>
+        <w:pStyle w:val="Text"/>
+      </w:pPr>
+      <w:r>
+        <w:t>Finalmente, el uso de diferencias centrales en los puntos interiores permite mejorar la precisión de los resultados, mientras que las diferencias progresivas y regresivas garantizan la aplicación del método en los extremos de la tabla.</w:t>
+      </w:r>
+    </w:p>
+    <w:p>
+      <w:pPr>
+        <w:pStyle w:val="Text"/>
+      </w:pPr>
+      <w:r>
+        <w:t>Las diferencias finitas constituyen una herramienta fundamental en los métodos numéricos para aproximar derivadas a partir de valores discretos de una función. Estas aproximaciones se basan en el desarrollo en serie de Taylor, lo que permite expresar la derivada en un punto a partir de los valores de la función en puntos cercanos.</w:t>
       </w:r>
     </w:p>
     <w:p>
@@ -1113,6 +1484,7 @@
           <w:noProof/>
           <w:color w:val="0E00FF"/>
         </w:rPr>
+        <w:lastRenderedPageBreak/>
         <w:t xml:space="preserve">for </w:t>
       </w:r>
       <w:r>
@@ -1629,80 +2001,83 @@
       <w:pPr>
         <w:pStyle w:val="Ttulo1"/>
       </w:pPr>
-      <w:bookmarkStart w:id="2" w:name="_Toc228825870"/>
-      <w:r>
-        <w:t>Interpolación</w:t>
-      </w:r>
-      <w:r>
-        <w:t xml:space="preserve"> de Lagrange</w:t>
+      <w:bookmarkStart w:id="2" w:name="_Toc228826721"/>
+      <w:r>
+        <w:t>Interpolación de Lagrange</w:t>
       </w:r>
       <w:bookmarkEnd w:id="2"/>
     </w:p>
     <w:p>
       <w:pPr>
         <w:pStyle w:val="Text"/>
-      </w:pPr>
-      <w:r>
-        <w:t xml:space="preserve">A </w:t>
-      </w:r>
-      <w:r>
-        <w:t>continuación</w:t>
-      </w:r>
-      <w:r>
-        <w:t xml:space="preserve">, se utiliza la </w:t>
-      </w:r>
-      <w:r>
-        <w:t>interpolación</w:t>
-      </w:r>
-      <w:r>
-        <w:t xml:space="preserve"> de Lagrange para calcular y estimar el valor de </w:t>
-      </w:r>
-      <w:r>
-        <w:t>Beta</w:t>
-      </w:r>
-      <w:r>
-        <w:t xml:space="preserve"> cuando </w:t>
+        <w:contextualSpacing/>
+      </w:pPr>
+      <w:r>
+        <w:t>La interpolación de Lagrange es un método numérico que permite estimar el valor de una función en un punto intermedio a partir de un conjunto de datos. Este método consiste en construir un polinomio que pasa exactamente por todos los puntos conocidos, de manera que se pueda evaluar dicho polinomio en el punto deseado.</w:t>
+      </w:r>
+    </w:p>
+    <w:p>
+      <w:pPr>
+        <w:pStyle w:val="Text"/>
+        <w:contextualSpacing/>
+      </w:pPr>
+      <w:r>
+        <w:t>El polinomio interpolador se obtiene como combinación lineal de los valores conocidos, ponderados mediante funciones base denominadas polinomios de Lagrange. De esta forma, se garantiza que el polinomio resultante coincide con los datos originales en cada uno de los puntos de la tabla.</w:t>
+      </w:r>
+    </w:p>
+    <w:p>
+      <w:pPr>
+        <w:pStyle w:val="Text"/>
+        <w:contextualSpacing/>
+      </w:pPr>
+      <w:r>
+        <w:t xml:space="preserve">En este trabajo se ha utilizado la interpolación de Lagrange para estimar el valor de beta cuando </w:t>
       </w:r>
       <w:r>
         <w:t>Alpha</w:t>
       </w:r>
       <w:r>
-        <w:t xml:space="preserve"> es igual a 17 grados. La interpolación se ha realizado utilizando directamente los valores de </w:t>
+        <w:t xml:space="preserve"> es igual a 17 grados. Para ello, se han seleccionado los cuatro puntos más cercanos, con el objetivo de construir un polinomio de grado 3 que proporcione una aproximación local precisa.</w:t>
+      </w:r>
+    </w:p>
+    <w:p>
+      <w:pPr>
+        <w:pStyle w:val="Text"/>
+        <w:contextualSpacing/>
+      </w:pPr>
+      <w:r>
+        <w:lastRenderedPageBreak/>
+        <w:t>El uso de un número reducido de puntos evita la aparición de oscilaciones indeseadas asociadas a polinomios de alto grado, fenómeno conocido como fenómeno de Runge. Por este motivo, el empleo de los puntos más cercanos permite obtener una estimación más estable y representativa en el entorno del valor considerado.</w:t>
+      </w:r>
+    </w:p>
+    <w:p>
+      <w:pPr>
+        <w:pStyle w:val="Text"/>
+        <w:contextualSpacing/>
+      </w:pPr>
+      <w:r>
+        <w:t xml:space="preserve">La interpolación se ha realizado utilizando directamente los valores de </w:t>
       </w:r>
       <w:r>
         <w:t>Alpha</w:t>
       </w:r>
       <w:r>
-        <w:t xml:space="preserve"> en grados, ya que el polinomio de Lagrange es independiente de la unidad siempre que se mantenga coherencia en los datos.</w:t>
+        <w:t xml:space="preserve"> en grados, ya que el método es independiente de la unidad empleada siempre que se mantenga la coherencia en los datos. Como resultado, se obtiene una aproximación del valor de </w:t>
+      </w:r>
+      <w:r>
+        <w:t>B</w:t>
+      </w:r>
+      <w:r>
+        <w:t>eta en el punto solicitado</w:t>
+      </w:r>
+      <w:r>
+        <w:t>.</w:t>
       </w:r>
     </w:p>
     <w:p>
       <w:pPr>
         <w:pStyle w:val="Text"/>
       </w:pPr>
-      <w:r>
-        <w:t>Se han utilizado únicamente los cuatro puntos más cercanos para construir el polinomio interpolador, ya que el uso de un número elevado de puntos aumenta el grado del polinomio y puede provocar inestabilidad numérica (fenómeno de Runge). Al emplear un subconjunto local de datos, se obtiene una aproximación más precisa y estable en el entorno del punto, reduciendo el error.</w:t>
-      </w:r>
-    </w:p>
-    <w:p>
-      <w:pPr>
-        <w:pStyle w:val="Text"/>
-      </w:pPr>
-      <w:r>
-        <w:t xml:space="preserve">Al finalizar esta </w:t>
-      </w:r>
-      <w:r>
-        <w:t>sección</w:t>
-      </w:r>
-      <w:r>
-        <w:t xml:space="preserve"> de </w:t>
-      </w:r>
-      <w:r>
-        <w:t>código</w:t>
-      </w:r>
-      <w:r>
-        <w:t>, se muestran los resultados obtenidos.</w:t>
-      </w:r>
     </w:p>
     <w:p>
       <w:pPr>
@@ -1713,7 +2088,6 @@
           <w:noProof/>
           <w:color w:val="008013"/>
         </w:rPr>
-        <w:lastRenderedPageBreak/>
         <w:t>% Valor donde queremos interpolar (en grados)</w:t>
       </w:r>
     </w:p>
@@ -2059,47 +2433,95 @@
       <w:pPr>
         <w:pStyle w:val="Ttulo1"/>
       </w:pPr>
-      <w:bookmarkStart w:id="3" w:name="_Toc228825871"/>
-      <w:r>
-        <w:t>Cálculo</w:t>
-      </w:r>
-      <w:r>
-        <w:t xml:space="preserve"> de la segunda derivada</w:t>
+      <w:bookmarkStart w:id="3" w:name="_Toc228826722"/>
+      <w:r>
+        <w:t>Cálculo de la segunda derivada</w:t>
       </w:r>
       <w:bookmarkEnd w:id="3"/>
     </w:p>
     <w:p>
       <w:pPr>
         <w:pStyle w:val="Text"/>
+        <w:contextualSpacing/>
       </w:pPr>
       <w:r>
         <w:t xml:space="preserve">Para el cálculo de la segunda derivada de </w:t>
       </w:r>
       <w:r>
-        <w:t>Beta</w:t>
-      </w:r>
-      <w:r>
-        <w:t xml:space="preserve"> respecto a </w:t>
+        <w:t>B</w:t>
+      </w:r>
+      <w:r>
+        <w:t xml:space="preserve">eta respecto a </w:t>
+      </w:r>
+      <w:r>
+        <w:t>A</w:t>
+      </w:r>
+      <w:r>
+        <w:t xml:space="preserve">lpha en el punto </w:t>
       </w:r>
       <w:r>
         <w:t>Alpha</w:t>
       </w:r>
       <w:r>
-        <w:t xml:space="preserve"> en 17 grados, se ha construido un polinomio interpolador de grado 3 utilizando los cuatro puntos más cercanos. A partir de dicho polinomio, se han obtenido sus derivadas sucesivas, y se finaliza evaluando la segunda derivada en el punto.</w:t>
+        <w:t xml:space="preserve"> = 17 grados, se ha utilizado interpolación polinómica. En concreto, se ha construido un polinomio interpolador de grado 3 empleando los cuatro puntos más cercanos.</w:t>
       </w:r>
     </w:p>
     <w:p>
       <w:pPr>
         <w:pStyle w:val="Text"/>
-      </w:pPr>
-      <w:r>
-        <w:t xml:space="preserve">Al final de la </w:t>
-      </w:r>
-      <w:r>
-        <w:t>sección</w:t>
-      </w:r>
-      <w:r>
-        <w:t xml:space="preserve"> se muestra los resultados obtenidos.</w:t>
+        <w:contextualSpacing/>
+      </w:pPr>
+      <w:r>
+        <w:lastRenderedPageBreak/>
+        <w:t xml:space="preserve">Este polinomio permite aproximar el comportamiento local de la función </w:t>
+      </w:r>
+      <w:r>
+        <w:t>B</w:t>
+      </w:r>
+      <w:r>
+        <w:t>eta en el entorno del punto considerado. A partir de dicho polinomio, se han obtenido sus derivadas de forma analítica, lo que proporciona una aproximación más suave y estable que el uso directo de diferencias finitas para derivadas de orden superior.</w:t>
+      </w:r>
+    </w:p>
+    <w:p>
+      <w:pPr>
+        <w:pStyle w:val="Text"/>
+        <w:contextualSpacing/>
+      </w:pPr>
+      <w:r>
+        <w:t>Una vez construido el polinomio interpolador, se ha calculado su primera y segunda derivada, evaluando finalmente la segunda derivada</w:t>
+      </w:r>
+      <w:r>
+        <w:t>.</w:t>
+      </w:r>
+    </w:p>
+    <w:p>
+      <w:pPr>
+        <w:pStyle w:val="Text"/>
+        <w:contextualSpacing/>
+      </w:pPr>
+      <w:r>
+        <w:t>El valor obtenido para la segunda derivada indica cómo varía la pendiente de la función en el entorno considerado.</w:t>
+      </w:r>
+    </w:p>
+    <w:p>
+      <w:pPr>
+        <w:pStyle w:val="Text"/>
+        <w:contextualSpacing/>
+      </w:pPr>
+      <w:r>
+        <w:t xml:space="preserve">Cabe destacar que el uso de un número reducido de puntos cercanos mejora la precisión local de la aproximación y evita inestabilidades asociadas a polinomios de mayor grado. Además, las unidades de la segunda derivada corresponden a radianes por grado al cuadrado, dado que </w:t>
+      </w:r>
+      <w:r>
+        <w:t>B</w:t>
+      </w:r>
+      <w:r>
+        <w:t xml:space="preserve">eta está expresado en radianes y </w:t>
+      </w:r>
+      <w:r>
+        <w:t>Alpha</w:t>
+      </w:r>
+      <w:r>
+        <w:t xml:space="preserve"> en grados.</w:t>
       </w:r>
     </w:p>
     <w:p>
@@ -2222,7 +2644,6 @@
         <w:rPr>
           <w:noProof/>
         </w:rPr>
-        <w:lastRenderedPageBreak/>
         <w:t>fprintf(</w:t>
       </w:r>
       <w:r>
@@ -2296,14 +2717,58 @@
         <w:pStyle w:val="Ttulo1"/>
         <w:divId w:val="990521434"/>
       </w:pPr>
+      <w:bookmarkStart w:id="4" w:name="_Toc228826723"/>
+      <w:r>
+        <w:t>Conclusiones</w:t>
+      </w:r>
+      <w:bookmarkEnd w:id="4"/>
+    </w:p>
+    <w:p>
+      <w:pPr>
+        <w:pStyle w:val="Text"/>
+        <w:contextualSpacing/>
+        <w:divId w:val="990521434"/>
+      </w:pPr>
+      <w:r>
+        <w:t>En este trabajo se ha comprobado que es posible obtener información relevante del sistema a partir de datos discretos. Mediante diferencias finitas de orden 2 se ha calculado la velocidad angular asociada a Beta</w:t>
+      </w:r>
+      <w:r>
+        <w:t>.</w:t>
+      </w:r>
+    </w:p>
+    <w:p>
+      <w:pPr>
+        <w:pStyle w:val="Text"/>
+        <w:contextualSpacing/>
+        <w:divId w:val="990521434"/>
+      </w:pPr>
+      <w:r>
+        <w:t>La interpolación de Lagrange ha permitido estimar el valor de Beta en Alpha = 17</w:t>
+      </w:r>
+      <w:r>
+        <w:t xml:space="preserve"> grados.</w:t>
+      </w:r>
+      <w:r>
+        <w:t xml:space="preserve"> Además, el uso de interpolación polinómica ha facilitado el cálculo de la segunda derivada, proporcionando información sobre la curvatura de la función en ese punto.</w:t>
+      </w:r>
+    </w:p>
+    <w:p>
+      <w:pPr>
+        <w:pStyle w:val="Text"/>
+        <w:divId w:val="990521434"/>
+      </w:pPr>
+      <w:r>
+        <w:t>En conjunto, los resultados muestran que las herramientas utilizadas son adecuadas para analizar el comportamiento del mecanismo, siempre que se seleccionen correctamente los puntos y se mantenga consistencia en las unidades.</w:t>
+      </w:r>
     </w:p>
     <w:p>
       <w:pPr>
         <w:pStyle w:val="Ttulo1"/>
         <w:divId w:val="990521434"/>
       </w:pPr>
-      <w:bookmarkStart w:id="4" w:name="_Toc228825872"/>
-      <w:r>
+      <w:bookmarkStart w:id="5" w:name="_Toc228826724"/>
+      <w:r>
+        <w:lastRenderedPageBreak/>
         <w:t xml:space="preserve">Enlace al </w:t>
       </w:r>
       <w:r>
@@ -2324,14 +2789,14 @@
       <w:r>
         <w:t>ub con los archivos generados</w:t>
       </w:r>
-      <w:bookmarkEnd w:id="4"/>
+      <w:bookmarkEnd w:id="5"/>
     </w:p>
     <w:p>
       <w:pPr>
         <w:pStyle w:val="Text"/>
         <w:divId w:val="990521434"/>
       </w:pPr>
-      <w:hyperlink r:id="rId9" w:history="1">
+      <w:hyperlink r:id="rId10" w:history="1">
         <w:r>
           <w:rPr>
             <w:rStyle w:val="Hipervnculo"/>
@@ -2352,7 +2817,7 @@
       </w:pPr>
     </w:p>
     <w:sectPr>
-      <w:footerReference w:type="default" r:id="rId10"/>
+      <w:footerReference w:type="default" r:id="rId11"/>
       <w:pgSz w:w="12240" w:h="15840"/>
       <w:pgMar w:top="560" w:right="560" w:bottom="560" w:left="560" w:header="720" w:footer="720" w:gutter="0"/>
       <w:pgNumType w:start="1"/>
@@ -2474,6 +2939,155 @@
 <file path=word/numbering.xml><?xml version="1.0" encoding="utf-8"?>
 <w:numbering xmlns:wpc="http://schemas.microsoft.com/office/word/2010/wordprocessingCanvas" xmlns:cx="http://schemas.microsoft.com/office/drawing/2014/chartex" xmlns:cx1="http://schemas.microsoft.com/office/drawing/2015/9/8/chartex" xmlns:cx2="http://schemas.microsoft.com/office/drawing/2015/10/21/chartex" xmlns:cx3="http://schemas.microsoft.com/office/drawing/2016/5/9/chartex" xmlns:cx4="http://schemas.microsoft.com/office/drawing/2016/5/10/chartex" xmlns:cx5="http://schemas.microsoft.com/office/drawing/2016/5/11/chartex" xmlns:cx6="http://schemas.microsoft.com/office/drawing/2016/5/12/chartex" xmlns:cx7="http://schemas.microsoft.com/office/drawing/2016/5/13/chartex" xmlns:cx8="http://schemas.microsoft.com/office/drawing/2016/5/14/chartex" xmlns:mc="http://schemas.openxmlformats.org/markup-compatibility/2006" xmlns:aink="http://schemas.microsoft.com/office/drawing/2016/ink" xmlns:am3d="http://schemas.microsoft.com/office/drawing/2017/model3d" xmlns:o="urn:schemas-microsoft-com:office:office" xmlns:oel="http://schemas.microsoft.com/office/2019/extlst" xmlns:r="http://schemas.openxmlformats.org/officeDocument/2006/relationships" xmlns:m="http://schemas.openxmlformats.org/officeDocument/2006/math" xmlns:v="urn:schemas-microsoft-com:vml" xmlns:wp14="http://schemas.microsoft.com/office/word/2010/wordprocessingDrawing" xmlns:wp="http://schemas.openxmlformats.org/drawingml/2006/wordprocessingDrawing" xmlns:w10="urn:schemas-microsoft-com:office:word" xmlns:w="http://schemas.openxmlformats.org/wordprocessingml/2006/main" xmlns:w14="http://schemas.microsoft.com/office/word/2010/wordml" xmlns:w15="http://schemas.microsoft.com/office/word/2012/wordml" xmlns:w16cex="http://schemas.microsoft.com/office/word/2018/wordml/cex" xmlns:w16cid="http://schemas.microsoft.com/office/word/2016/wordml/cid" xmlns:w16="http://schemas.microsoft.com/office/word/2018/wordml" xmlns:w16du="http://schemas.microsoft.com/office/word/2023/wordml/word16du" xmlns:w16sdtdh="http://schemas.microsoft.com/office/word/2020/wordml/sdtdatahash" xmlns:w16sdtfl="http://schemas.microsoft.com/office/word/2024/wordml/sdtformatlock" xmlns:w16se="http://schemas.microsoft.com/office/word/2015/wordml/symex" xmlns:wpg="http://schemas.microsoft.com/office/word/2010/wordprocessingGroup" xmlns:wpi="http://schemas.microsoft.com/office/word/2010/wordprocessingInk" xmlns:wne="http://schemas.microsoft.com/office/word/2006/wordml" xmlns:wps="http://schemas.microsoft.com/office/word/2010/wordprocessingShape" mc:Ignorable="w14 w15 w16se w16cid w16 w16cex w16sdtdh w16sdtfl w16du wp14">
   <w:abstractNum w:abstractNumId="0" w15:restartNumberingAfterBreak="0">
+    <w:nsid w:val="2EB0642C"/>
+    <w:multiLevelType w:val="multilevel"/>
+    <w:tmpl w:val="6B284794"/>
+    <w:lvl w:ilvl="0">
+      <w:start w:val="1"/>
+      <w:numFmt w:val="bullet"/>
+      <w:lvlText w:val=""/>
+      <w:lvlJc w:val="left"/>
+      <w:pPr>
+        <w:tabs>
+          <w:tab w:val="num" w:pos="720"/>
+        </w:tabs>
+        <w:ind w:left="720" w:hanging="360"/>
+      </w:pPr>
+      <w:rPr>
+        <w:rFonts w:ascii="Symbol" w:hAnsi="Symbol" w:hint="default"/>
+        <w:sz w:val="20"/>
+      </w:rPr>
+    </w:lvl>
+    <w:lvl w:ilvl="1" w:tentative="1">
+      <w:start w:val="1"/>
+      <w:numFmt w:val="bullet"/>
+      <w:lvlText w:val="o"/>
+      <w:lvlJc w:val="left"/>
+      <w:pPr>
+        <w:tabs>
+          <w:tab w:val="num" w:pos="1440"/>
+        </w:tabs>
+        <w:ind w:left="1440" w:hanging="360"/>
+      </w:pPr>
+      <w:rPr>
+        <w:rFonts w:ascii="Courier New" w:hAnsi="Courier New" w:hint="default"/>
+        <w:sz w:val="20"/>
+      </w:rPr>
+    </w:lvl>
+    <w:lvl w:ilvl="2" w:tentative="1">
+      <w:start w:val="1"/>
+      <w:numFmt w:val="bullet"/>
+      <w:lvlText w:val=""/>
+      <w:lvlJc w:val="left"/>
+      <w:pPr>
+        <w:tabs>
+          <w:tab w:val="num" w:pos="2160"/>
+        </w:tabs>
+        <w:ind w:left="2160" w:hanging="360"/>
+      </w:pPr>
+      <w:rPr>
+        <w:rFonts w:ascii="Wingdings" w:hAnsi="Wingdings" w:hint="default"/>
+        <w:sz w:val="20"/>
+      </w:rPr>
+    </w:lvl>
+    <w:lvl w:ilvl="3" w:tentative="1">
+      <w:start w:val="1"/>
+      <w:numFmt w:val="bullet"/>
+      <w:lvlText w:val=""/>
+      <w:lvlJc w:val="left"/>
+      <w:pPr>
+        <w:tabs>
+          <w:tab w:val="num" w:pos="2880"/>
+        </w:tabs>
+        <w:ind w:left="2880" w:hanging="360"/>
+      </w:pPr>
+      <w:rPr>
+        <w:rFonts w:ascii="Wingdings" w:hAnsi="Wingdings" w:hint="default"/>
+        <w:sz w:val="20"/>
+      </w:rPr>
+    </w:lvl>
+    <w:lvl w:ilvl="4" w:tentative="1">
+      <w:start w:val="1"/>
+      <w:numFmt w:val="bullet"/>
+      <w:lvlText w:val=""/>
+      <w:lvlJc w:val="left"/>
+      <w:pPr>
+        <w:tabs>
+          <w:tab w:val="num" w:pos="3600"/>
+        </w:tabs>
+        <w:ind w:left="3600" w:hanging="360"/>
+      </w:pPr>
+      <w:rPr>
+        <w:rFonts w:ascii="Wingdings" w:hAnsi="Wingdings" w:hint="default"/>
+        <w:sz w:val="20"/>
+      </w:rPr>
+    </w:lvl>
+    <w:lvl w:ilvl="5" w:tentative="1">
+      <w:start w:val="1"/>
+      <w:numFmt w:val="bullet"/>
+      <w:lvlText w:val=""/>
+      <w:lvlJc w:val="left"/>
+      <w:pPr>
+        <w:tabs>
+          <w:tab w:val="num" w:pos="4320"/>
+        </w:tabs>
+        <w:ind w:left="4320" w:hanging="360"/>
+      </w:pPr>
+      <w:rPr>
+        <w:rFonts w:ascii="Wingdings" w:hAnsi="Wingdings" w:hint="default"/>
+        <w:sz w:val="20"/>
+      </w:rPr>
+    </w:lvl>
+    <w:lvl w:ilvl="6" w:tentative="1">
+      <w:start w:val="1"/>
+      <w:numFmt w:val="bullet"/>
+      <w:lvlText w:val=""/>
+      <w:lvlJc w:val="left"/>
+      <w:pPr>
+        <w:tabs>
+          <w:tab w:val="num" w:pos="5040"/>
+        </w:tabs>
+        <w:ind w:left="5040" w:hanging="360"/>
+      </w:pPr>
+      <w:rPr>
+        <w:rFonts w:ascii="Wingdings" w:hAnsi="Wingdings" w:hint="default"/>
+        <w:sz w:val="20"/>
+      </w:rPr>
+    </w:lvl>
+    <w:lvl w:ilvl="7" w:tentative="1">
+      <w:start w:val="1"/>
+      <w:numFmt w:val="bullet"/>
+      <w:lvlText w:val=""/>
+      <w:lvlJc w:val="left"/>
+      <w:pPr>
+        <w:tabs>
+          <w:tab w:val="num" w:pos="5760"/>
+        </w:tabs>
+        <w:ind w:left="5760" w:hanging="360"/>
+      </w:pPr>
+      <w:rPr>
+        <w:rFonts w:ascii="Wingdings" w:hAnsi="Wingdings" w:hint="default"/>
+        <w:sz w:val="20"/>
+      </w:rPr>
+    </w:lvl>
+    <w:lvl w:ilvl="8" w:tentative="1">
+      <w:start w:val="1"/>
+      <w:numFmt w:val="bullet"/>
+      <w:lvlText w:val=""/>
+      <w:lvlJc w:val="left"/>
+      <w:pPr>
+        <w:tabs>
+          <w:tab w:val="num" w:pos="6480"/>
+        </w:tabs>
+        <w:ind w:left="6480" w:hanging="360"/>
+      </w:pPr>
+      <w:rPr>
+        <w:rFonts w:ascii="Wingdings" w:hAnsi="Wingdings" w:hint="default"/>
+        <w:sz w:val="20"/>
+      </w:rPr>
+    </w:lvl>
+  </w:abstractNum>
+  <w:abstractNum w:abstractNumId="1" w15:restartNumberingAfterBreak="0">
     <w:nsid w:val="400413A7"/>
     <w:multiLevelType w:val="hybridMultilevel"/>
     <w:tmpl w:val="201C2A80"/>
@@ -2531,6 +3145,9 @@
     </w:lvl>
   </w:abstractNum>
   <w:num w:numId="1" w16cid:durableId="248975976">
+    <w:abstractNumId w:val="1"/>
+  </w:num>
+  <w:num w:numId="2" w16cid:durableId="1171871615">
     <w:abstractNumId w:val="0"/>
   </w:num>
 </w:numbering>
@@ -2754,7 +3371,6 @@
   <w:style w:type="character" w:default="1" w:styleId="Fuentedeprrafopredeter">
     <w:name w:val="Default Paragraph Font"/>
     <w:uiPriority w:val="1"/>
-    <w:semiHidden/>
     <w:unhideWhenUsed/>
   </w:style>
   <w:style w:type="table" w:default="1" w:styleId="Tablanormal">
@@ -2801,10 +3417,9 @@
   <w:style w:type="paragraph" w:customStyle="1" w:styleId="Text">
     <w:name w:val="Text"/>
     <w:qFormat/>
-    <w:rsid w:val="00A6499B"/>
+    <w:rsid w:val="00A11023"/>
     <w:pPr>
       <w:spacing w:before="100" w:beforeAutospacing="1" w:after="100" w:afterAutospacing="1" w:line="360" w:lineRule="auto"/>
-      <w:contextualSpacing/>
     </w:pPr>
     <w:rPr>
       <w:rFonts w:ascii="Calibri" w:eastAsia="Yu Gothic Medium" w:hAnsi="Calibri" w:cstheme="majorBidi"/>
@@ -3347,10 +3962,29 @@
 </file>
 
 <file path=customXml/item1.xml><?xml version="1.0" encoding="utf-8"?>
+<CoverPageProperties xmlns="http://schemas.microsoft.com/office/2006/coverPageProps">
+  <PublishDate>2026</PublishDate>
+  <Abstract/>
+  <CompanyAddress/>
+  <CompanyPhone/>
+  <CompanyFax/>
+  <CompanyEmail/>
+</CoverPageProperties>
+</file>
+
+<file path=customXml/item2.xml><?xml version="1.0" encoding="utf-8"?>
 <b:Sources xmlns:b="http://schemas.openxmlformats.org/officeDocument/2006/bibliography" xmlns="http://schemas.openxmlformats.org/officeDocument/2006/bibliography" SelectedStyle="\APASixthEditionOfficeOnline.xsl" StyleName="APA" Version="6"/>
 </file>
 
 <file path=customXml/itemProps1.xml><?xml version="1.0" encoding="utf-8"?>
+<ds:datastoreItem xmlns:ds="http://schemas.openxmlformats.org/officeDocument/2006/customXml" ds:itemID="{55AF091B-3C7A-41E3-B477-F2FDAA23CFDA}">
+  <ds:schemaRefs>
+    <ds:schemaRef ds:uri="http://schemas.microsoft.com/office/2006/coverPageProps"/>
+  </ds:schemaRefs>
+</ds:datastoreItem>
+</file>
+
+<file path=customXml/itemProps2.xml><?xml version="1.0" encoding="utf-8"?>
 <ds:datastoreItem xmlns:ds="http://schemas.openxmlformats.org/officeDocument/2006/customXml" ds:itemID="{3AAEB55D-78FB-48C6-AF1A-586D59E5FA71}">
   <ds:schemaRefs>
     <ds:schemaRef ds:uri="http://schemas.openxmlformats.org/officeDocument/2006/bibliography"/>

</xml_diff>